<commit_message>
S2 revised after review: no isolated score, audit described as summary with epoch eligibility, interpretive readings, F-1 test classification, HTV-2 without terminal success
</commit_message>
<xml_diff>
--- a/supplementary/KMC_Supplementary_S2_Documented_Programs.docx
+++ b/supplementary/KMC_Supplementary_S2_Documented_Programs.docx
@@ -175,7 +175,23 @@
           <w:color w:val="1F2A37"/>
           <w:sz w:val="20"/>
         </w:rPr>
-        <w:t>Records were grouped in four cumulative documentary epochs: E1, preflight planning (October 2000); E2, investigation (through May 2003); E3, corrective actions (through March 2004); and E4, retrospective results (through June 2006). The epochs contain 3, 7, 14, and 19 observations. Publication dates delimit the epochs; they do not establish what individual engineers knew, and later reconstructions were excluded from earlier epochs. Repeated accounts of the same event were linked rather than counted as independent demonstrations. Conflicting values were preserved rather than averaged: the first-flight release altitude appears as about 20,000 ft [55], 24,000 ft [56], and 23,000 ft [60], and the 22,244 ft reported at failure time 13.5 s [14] is not a release altitude.</w:t>
+        <w:t>Each document entered the epochs by its publication date: [54] in E1, [14] in E2, [55] and [56] in E3, and [57]–[59] in E4. The NASA historical page [60], updated in 2025, belongs to no epoch: it is used only to record a conflicting release altitude and never enters an assessment, so no information published after June 2006 enters any epoch.</w:t>
+      </w:r>
+    </w:p>
+    <w:p>
+      <w:pPr>
+        <w:spacing w:after="120" w:before="0" w:line="276" w:lineRule="auto"/>
+        <w:jc w:val="both"/>
+      </w:pPr>
+      <w:r>
+        <w:rPr>
+          <w:rFonts w:ascii="Arial" w:hAnsi="Arial" w:eastAsia="Arial"/>
+          <w:b w:val="0"/>
+          <w:i w:val="0"/>
+          <w:color w:val="1F2A37"/>
+          <w:sz w:val="20"/>
+        </w:rPr>
+        <w:t>Records were grouped in four cumulative documentary epochs: E1, preflight planning (October 2000); E2, investigation (through May 2003); E3, corrective actions (through March 2004); and E4, retrospective results (through June 2006). The epochs contain 3, 7, 14, and 19 observations; these cumulative counts organize the documents and are not independent samples. Publication dates delimit the epochs; they do not establish what individual engineers knew, and later reconstructions were excluded from earlier epochs. Repeated accounts of the same event were linked rather than counted as independent demonstrations. Conflicting values were preserved rather than averaged: the first-flight release altitude appears as about 20,000 ft [55], 24,000 ft [56], and 23,000 ft [60], and the 22,244 ft reported at failure time 13.5 s [14] is not a release altitude.</w:t>
       </w:r>
     </w:p>
     <w:p>
@@ -191,7 +207,7 @@
           <w:color w:val="1F2A37"/>
           <w:sz w:val="21"/>
         </w:rPr>
-        <w:t>2.2 Coverage audit</w:t>
+        <w:t>2.2 Summary of the documentary audit</w:t>
       </w:r>
     </w:p>
     <w:p>
@@ -207,7 +223,7 @@
           <w:color w:val="1F2A37"/>
           <w:sz w:val="20"/>
         </w:rPr>
-        <w:t>The audit enumerates 120 units: three claims × ten rubric criteria × four epochs. For each unit it recorded the candidate passages, the configuration to which they apply, the missing information, and whether the evidence was sufficient for a complete anchored assessment. None was: every unit remained not assessed. Typical gaps were final model versions and complete parameter distributions (C1, C2), closure of reviews and acceptance records, repeatability, and activity-level costs (C3), and export-controlled material omitted from the public investigation [14]. The result supports the restriction of the article to qualitative readings; it does not show that the program lacked the evidence.</w:t>
+        <w:t>The audit enumerates 120 criterion-level units, three claims × ten rubric criteria × four epochs, that is, twelve claim–epoch profiles of ten criteria each. For each unit it recorded the candidate passages, the configuration to which they apply, the missing information, and whether the evidence was sufficient to place the criterion on an anchor of Table 4. None was, so every unit remained not assessed and no profile, and hence no K or M, could be formed. Typical gaps were final model versions and complete parameter distributions (C1, C2), closure of reviews and acceptance records, repeatability, and activity-level costs (C3), and export-controlled material omitted from the public investigation [14]. The result supports the restriction of the article to qualitative readings; it does not show that the program lacked the evidence. This section summarizes the audit; the unit-level working records are not reproduced in this supplement.</w:t>
       </w:r>
     </w:p>
     <w:p>
@@ -239,7 +255,7 @@
           <w:color w:val="1F2A37"/>
           <w:sz w:val="20"/>
         </w:rPr>
-        <w:t>The preflight paper reported control-law refinement and Monte Carlo analysis of aerodynamic and flight-control uncertainties, and a trajectory different from that of the heritage booster [54]. After the loss of control during boost on 2 June 2001, the investigation found inaccuracies in inherited and HXLV-specific models: corrected nominal models reduced the predicted roll-axis gain margin from 8 dB to less than 2 dB against a 6 dB requirement, and reproducing the mishap required combining the model corrections with parameter uncertainty [14] (Fig. S2-1). Return to flight combined wind-tunnel and actuator tests, revised models, comparisons of independent boost simulations, stronger actuators, and propellant off-loading for a higher-altitude release that reduced exposure [55], [56]. A test-setup anomaly on 11 February 2004 exceeded the qualified actuator torque and led to replacement and investigation before the second flight [61]. On 27 March 2004 the HXLV delivered the research vehicle at 28.67 km (94,069 ft) against 28.63 km (93,932 ft) planned and at Mach 6.946 against 7.075 [57], [58], and the Mach 10 flight later in 2004 also achieved separation within tolerances [59]. A lessons-learned review relates the accident to heritage assumptions, representative testing, stability margins, and uncertainty and dynamic modeling [62]. Fig. S2-2 separates the event dates from the dates of the documents that report them.</w:t>
+        <w:t>The preflight paper reported control-law refinement and Monte Carlo analysis of aerodynamic and flight-control uncertainties, and a trajectory different from that of the heritage booster [54]. After the loss of control during boost on 2 June 2001, the investigation found inaccuracies in inherited and HXLV-specific models: corrected nominal models reduced the predicted roll-axis gain margin from 8 dB to less than 2 dB against a 6 dB requirement, and reproducing the mishap required combining the model corrections with parameter uncertainty [14] (Fig. S2-1). Return to flight combined wind-tunnel and actuator tests, revised models, comparisons of independent boost simulations, stronger actuators, and propellant off-loading for a higher-altitude release that reduced exposure [55], [56]. A test-setup anomaly on 11 February 2004 exceeded the qualified actuator torque and led to replacement and investigation before the second flight [61]. On 27 March 2004 the HXLV delivered the research vehicle at 28.67 km (94,069 ft) against 28.63 km (93,932 ft) planned and at Mach 6.946 against 7.075 [57], [58]; the 2004 report states that both the Mach 7 and the Mach 10 flights delivered the research vehicle within the separation tolerances [59]. A lessons-learned review relates the accident to heritage assumptions, representative testing, stability margins, and uncertainty and dynamic modeling [62]. Fig. S2-2 separates the event dates from the dates of the documents that report them.</w:t>
       </w:r>
     </w:p>
     <w:p>
@@ -381,7 +397,38 @@
           <w:color w:val="1F2A37"/>
           <w:sz w:val="20"/>
         </w:rPr>
-        <w:t>In the terms of the article, an integrated test was attempted while knowledge of the configuration-specific claims rested on heritage transfer, and the result was an epistemic shock on C1–C3. Recovery came from the activities the model favors after a shock: separate-effects testing, revised models, and joint-uncertainty simulation, together with reduced exposure. Table S2-1 links the main observations to rubric criteria. Table S2-2 lists the postflight findings examined in the extension, and Table S2-3 a time-bounded check that uses only documents available before each flight, with cutoffs at the end of 1 June 2001 and 26 March 2004. The preflight sources support requests for evidence about domain transfer and uncertainty adequacy, but they do not establish that the model error was detectable before flight: the program, not KMC, detected and corrected the problems, and an equally informed conventional review could reach the same questions.</w:t>
+        <w:t xml:space="preserve">The margins of Fig. S2-1 are engineering quantities: 8 dB, 6 dB, and 2 dB correspond to gain factors of about 2.5, 2.0, and 1.26, and the corrected value is only an upper bound. They are not values of K or M, and the record gives no calibrated mapping between them; terms such as headroom or </w:t>
+      </w:r>
+      <w:r>
+        <w:rPr>
+          <w:rFonts w:ascii="Arial" w:hAnsi="Arial"/>
+          <w:b w:val="0"/>
+          <w:i/>
+          <w:color w:val="1F2A37"/>
+          <w:sz w:val="20"/>
+        </w:rPr>
+        <w:t>K</w:t>
+      </w:r>
+      <w:r>
+        <w:rPr>
+          <w:rFonts w:ascii="Arial" w:hAnsi="Arial"/>
+          <w:b w:val="0"/>
+          <w:i/>
+          <w:color w:val="1F2A37"/>
+          <w:sz w:val="20"/>
+          <w:vertAlign w:val="subscript"/>
+        </w:rPr>
+        <w:t>need</w:t>
+      </w:r>
+      <w:r>
+        <w:rPr>
+          <w:rFonts w:ascii="Arial" w:hAnsi="Arial" w:eastAsia="Arial"/>
+          <w:b w:val="0"/>
+          <w:i w:val="0"/>
+          <w:color w:val="1F2A37"/>
+          <w:sz w:val="20"/>
+        </w:rPr>
+        <w:t xml:space="preserve"> below are readings through the framework, not reconstructed states. With that caveat, an integrated test was attempted while knowledge of the configuration-specific claims rested on heritage transfer, and the result can be read as an epistemic shock on C1–C3. Recovery came from the activities the model favors after a shock: separate-effects testing, revised models, and joint-uncertainty simulation, together with reduced exposure. Table S2-1 links the main observations to rubric criteria. Table S2-2 lists the postflight findings examined in the extension, and Table S2-3 a time-bounded check that uses only documents available before each flight, with cutoffs at the end of 1 June 2001 and 26 March 2004. The preflight sources support requests for evidence about domain transfer and uncertainty adequacy, but they do not establish that the model error was detectable before flight: the program, not KMC, detected and corrected the problems, and an equally informed conventional review could reach the same questions.</w:t>
       </w:r>
     </w:p>
     <w:p>
@@ -802,7 +849,7 @@
                 <w:color w:val="1F2A37"/>
                 <w:sz w:val="16"/>
               </w:rPr>
-              <w:t>Flight-2 delivery within tolerance [57], [58]</w:t>
+              <w:t>Flight-2 delivery close to target (94,069 vs 93,932 ft; Mach 6.946 vs 7.075) and reported within separation tolerances [58], [59]</w:t>
             </w:r>
           </w:p>
         </w:tc>
@@ -2040,7 +2087,7 @@
           <w:color w:val="1F2A37"/>
           <w:sz w:val="20"/>
         </w:rPr>
-        <w:t>Two chains connect a documented observation to the choice of the next evidence-producing activity (Table S2-4). Chain A uses the investigation [14, pp. 6–7]: corrected nominal models remain stable and do not reproduce the loss of control, so coherence (C1) and uncertainty adequacy (C2) remain open, and the retained sequence couples targeted tests with joint-uncertainty simulation rather than closing on nominal stability. Chain B uses only the release of 17 February 2004 [61], before flight 2: exceeding the qualified torque removes the basis for accepting that actuator, so the retained sequence replaces and verifies it. One criterion can be coded from the record: for flight-1 boost control (C3), demonstrated performance is at level 0, because the essential performance criteria failed. The other nine criteria, and a comparable preflight profile, are not assessed, so no (K, M) point or slope dM/dK can be computed; the criterion-based branch of the procedure remains usable where the derivative-based branch is not. In both chains the program reached the same actions without KMC; the alternatives are analytical comparisons, not a recovered historical trade study, and their costs and durations are unknown.</w:t>
+        <w:t>Two chains connect a documented observation to the choice of the next evidence-producing activity (Table S2-4). Chain A uses the investigation [14, pp. 6–7]: corrected nominal models remain stable and do not reproduce the loss of control, so coherence (C1) and uncertainty adequacy (C2) remain open, and the retained sequence couples targeted tests with joint-uncertainty simulation rather than closing on nominal stability. Chain B uses only the release of 17 February 2004 [61], before flight 2: exceeding the qualified torque removes the basis for accepting that actuator, so the retained sequence replaces and verifies it. For flight-1 boost control (C3), the record shows that the mandatory demonstrated-performance condition was not met, because control was lost. This is a failed demonstration, not the absence of one, and no anchor of Table 4 is assigned; consistently with the audit of 2.2, the criteria remain not assessed, so no (K, M) point or slope dM/dK can be computed; the criterion-based branch of the procedure remains usable where the derivative-based branch is not. In both chains the program reached the same actions without KMC; the alternatives are analytical comparisons, not a recovered historical trade study, and their costs and durations are unknown.</w:t>
       </w:r>
     </w:p>
     <w:p>
@@ -2639,7 +2686,7 @@
           <w:color w:val="1F2A37"/>
           <w:sz w:val="20"/>
         </w:rPr>
-        <w:t>On 31 October 1963, Mueller directed that the first Saturn IB and Saturn V flights use all live stages and complete spacecraft, and that mission planning assume two successful flights before a crewed flight [63]. The first Saturn V flight, Apollo 4 on 9 November 1967, succeeded [17]. Apollo 6, on 4 April 1968, experienced pogo oscillations, the early shutdown of two second-stage engines, and a failed third-stage restart [17]. Engineers detuned the F-1 engines, charged the liquid-oxygen prevalve cavities with helium, and redesigned the J-2 augmented spark igniter lines, and on 27 April 1968 the third Saturn V was approved for a crew [17]. In the terms of the article, all-up testing concentrated maturity evidence in few expensive integrated tests; Apollo 6 produced shocks from couplings visible only at integrated level, and the program restored headroom through diagnosis and ground-verified fixes before the next integrated test, as steps 4 and 5 of Table 6 would direct.</w:t>
+        <w:t>On 31 October 1963, Mueller directed that the first Saturn IB and Saturn V flights use all live stages and complete spacecraft, and that mission planning assume two successful flights before a crewed flight [63]. The first Saturn V flight, Apollo 4 on 9 November 1967, succeeded [17]. Apollo 6, on 4 April 1968, experienced pogo oscillations, the early shutdown of two second-stage engines, and a failed third-stage restart [17]. Engineers detuned the F-1 engines, charged the liquid-oxygen prevalve cavities with helium, and redesigned the J-2 augmented spark igniter lines, and on 27 April 1968 the third Saturn V was approved for a crew [17]. Read through the model, all-up testing concentrated maturity evidence in few expensive integrated tests, Apollo 6 exposed couplings visible only at integrated level, and diagnosis and ground-verified fixes before the next integrated test correspond to what steps 4 and 5 of Table 6 would direct; the record does not give the knowledge state that the model would assign.</w:t>
       </w:r>
     </w:p>
     <w:p>
@@ -2671,7 +2718,7 @@
           <w:color w:val="1F2A37"/>
           <w:sz w:val="20"/>
         </w:rPr>
-        <w:t>Between October 1962 and September 1966, Project First, the F-1 combustion-stability program, conducted about 2000 of the roughly 3200 full-scale F-1 tests, combining fourteen injection patterns with fifteen baffle configurations and rating stability with bombs producing perturbations of about 100% of chamber pressure; full-scale test data were described as the most reliable source of design information [15]. The flight injector accumulated 703 engine tests [15]. This is the weak-simulation regime of Section V-C: with a low data-limited ceiling K̄, the model prescribes discriminating physical tests rather than more analysis, and the bomb test is a separate-effects stimulus that makes stability observable. The cost of the regime, thousands of full-scale tests, illustrates why weak simulation penalizes analysis-first and test-first logics in the model.</w:t>
+        <w:t>Between October 1962 and September 1966, Project First, the F-1 combustion-stability program, conducted about 2000 of the roughly 3200 full-scale F-1 tests, combining fourteen injection patterns with fifteen baffle configurations and rating stability with bombs producing perturbations of about 100% of chamber pressure; full-scale test data were described as the most reliable source of design information [15]. The flight injector accumulated 703 engine tests [15]. The bomb test is a controlled-perturbation test on full-scale combustion hardware: a local perturbation whose amplitude was about that of the mean chamber pressure, after which the oscillation either decays or persists, so stability becomes observable. It is not a separate-effects test in the usual sense, because the coupled combustion phenomena are all present; whether it counts as E or T in the model depends on the claim assessed (stability margin of an injector design, or the qualified engine). Read through the model, the program sits in the weak-simulation regime of Section V-C, where discriminating physical tests replace analysis as the source of knowledge. The large number of tests documents a high experimental effort; without comparable alternatives and costs, it does not show that another sequence would have been cheaper.</w:t>
       </w:r>
     </w:p>
     <w:p>
@@ -2703,7 +2750,7 @@
           <w:color w:val="1F2A37"/>
           <w:sz w:val="20"/>
         </w:rPr>
-        <w:t>Falcon 1 failed on its first three flights, in March 2006 (fuel leak and fire), March 2007 (second-stage control lost to propellant slosh), and August 2008 (first stage recontacted the second stage after separation), and reached orbit on 28 September 2008 [16], [64]. Each failure revealed a different mode and was followed by diagnosis and correction. Flights cost about 8 million US dollars against roughly 100 million for development [16]. In the terms of the article this is test-first development with integrated tests that were affordable relative to the program: shocks are frequent when knowledge is low, and the program reached the target after three of them. The record does not show how much each flight taught, and whether ground tests could have exposed these modes at lower cost is not established; Section VI-B of the article discusses why the launch-vehicle estimates support strong learning in flight only conditionally.</w:t>
+        <w:t>Falcon 1 failed on its first three flights, in March 2006 (fuel leak and fire), March 2007 (second-stage control lost to propellant slosh), and August 2008 (first stage recontacted the second stage after separation), and reached orbit on 28 September 2008 [16], [64]. Each failure revealed a different mode and was followed by diagnosis and correction. Flights cost about 8 million US dollars against roughly 100 million for development [16]. Read through the model, this is test-first development with integrated tests that were affordable relative to the program, and the program reached orbit after three failures. The record does not show how much each flight taught, and whether ground tests could have exposed these modes at lower cost is not established; Section VI-B of the article discusses why the launch-vehicle estimates support strong learning in flight only conditionally.</w:t>
       </w:r>
     </w:p>
     <w:p>
@@ -2735,7 +2782,7 @@
           <w:color w:val="1F2A37"/>
           <w:sz w:val="20"/>
         </w:rPr>
-        <w:t>The X-51A scramjet demonstrator flew four times. In May 2010 it flew for more than three minutes at Mach 4.88 under scramjet power [65]; in June 2011 the inlet unstarted during the transition to JP-7 fuel and restart attempts failed [66]; in August 2012 a cruiser control-fin fault caused the loss of the vehicle before scramjet ignition [65]; and on 1 May 2013 it flew for more than six minutes, three and a half under scramjet power, at Mach 5.1 [67]. The DARPA HTV-2 glider was lost on both of its flights. After the April 2010 flight, the engineering review board found higher-than-predicted adverse yaw coupled into roll that exceeded the available roll control [68]. That aerodynamic knowledge was incorporated into the August 2011 flight, which achieved controlled Mach 20 flight before unexpected aeroshell degradation caused upsets of increasing severity [68], [69]. The program manager stated that extrapolating from known flight regimes and relying solely on advanced thermal modeling and ground testing could not predict the Mach 20 environment [69].</w:t>
+        <w:t>The X-51A scramjet demonstrator flew four times. In May 2010 it flew for more than three minutes at Mach 4.88 under scramjet power [65]; in June 2011 the inlet unstarted during the transition to JP-7 fuel and restart attempts failed [66]; in August 2012 a cruiser control-fin fault caused the loss of the vehicle before scramjet ignition [65]; and on 1 May 2013 it flew for more than six minutes, three and a half under scramjet power, and reached Mach 5.1 [67]. The DARPA HTV-2 glider was lost on both of its flights. After the April 2010 flight, the engineering review board found higher-than-predicted adverse yaw coupled into roll that exceeded the available roll control [68]. That aerodynamic knowledge was incorporated into the August 2011 flight, which achieved controlled Mach 20 flight before unexpected aeroshell degradation caused upsets of increasing severity [68], [69]. The program manager stated that extrapolating from known flight regimes and relying solely on advanced thermal modeling and ground testing could not predict the Mach 20 environment [69].</w:t>
       </w:r>
     </w:p>
     <w:p>
@@ -2751,38 +2798,7 @@
           <w:color w:val="1F2A37"/>
           <w:sz w:val="20"/>
         </w:rPr>
-        <w:t xml:space="preserve">In the terms of the article, this is the data-limited ceiling K̄ stated by the programs themselves: analysis and ground testing could not raise configuration-specific knowledge to </w:t>
-      </w:r>
-      <w:r>
-        <w:rPr>
-          <w:rFonts w:ascii="Arial" w:hAnsi="Arial"/>
-          <w:b w:val="0"/>
-          <w:i/>
-          <w:color w:val="1F2A37"/>
-          <w:sz w:val="20"/>
-        </w:rPr>
-        <w:t>K</w:t>
-      </w:r>
-      <w:r>
-        <w:rPr>
-          <w:rFonts w:ascii="Arial" w:hAnsi="Arial"/>
-          <w:b w:val="0"/>
-          <w:i/>
-          <w:color w:val="1F2A37"/>
-          <w:sz w:val="20"/>
-          <w:vertAlign w:val="subscript"/>
-        </w:rPr>
-        <w:t>need</w:t>
-      </w:r>
-      <w:r>
-        <w:rPr>
-          <w:rFonts w:ascii="Arial" w:hAnsi="Arial" w:eastAsia="Arial"/>
-          <w:b w:val="0"/>
-          <w:i w:val="0"/>
-          <w:color w:val="1F2A37"/>
-          <w:sz w:val="20"/>
-        </w:rPr>
-        <w:t>, so each flight was both a demonstration and the main source of new knowledge, and each loss was an epistemic shock that exposed a different claim (propulsion, control surfaces, aerodynamic coupling, thermal protection).</w:t>
+        <w:t>Read through the model, the HTV-2 statement corresponds to a low data-limited ceiling K̄: analysis and ground testing could not provide the configuration-specific predictions the flights needed, so each flight was both a demonstration and the main source of new information, and each failure exposed a different subsystem (propulsion, control surfaces, aerodynamic coupling, thermal protection). The X-51A reached a successful flight after two failures; the HTV-2 shows learning between flights without a documented terminal success.</w:t>
       </w:r>
     </w:p>
     <w:p>
@@ -2814,7 +2830,7 @@
           <w:color w:val="1F2A37"/>
           <w:sz w:val="20"/>
         </w:rPr>
-        <w:t>Table S2-5 (Table 9 of the article) summarizes the six cases. In the five flight programs, integrated tests that exposed configuration-specific or integrated-level knowledge gaps produced shocks (X-43A flight 1, Apollo 6, Falcon 1 flights 1–3, X-51A flights 2–3, both HTV-2 flights), and success followed separate-effects testing, diagnosis, or analysis that restored headroom; in the F-1 program, the absence of predictive capability led directly to discriminating physical tests. The cases span the scenarios of Section V-C: costly, high-consequence integrated tests (X-43A, Saturn V), weak simulation (F-1, HTV-2, X-51A), and affordable flights (Falcon 1).</w:t>
+        <w:t>Table S2-5 (Table 9 of the article) summarizes the six cases; its third column is an interpretation through the model, not a measured state. In the five flight programs, failures followed integrated tests that exposed configuration-specific or integrated-level gaps (X-43A flight 1, Apollo 6, Falcon 1 flights 1–3, X-51A flights 2–3, both HTV-2 flights). In four of them (X-43A, Saturn V, Falcon 1, X-51A) a successful flight followed diagnosis, separate-effects testing, or analysis; the HTV-2 shows that learning after failures does not guarantee a final demonstration. In the F-1 program, the absence of predictive capability led directly to controlled-perturbation tests on full-scale hardware. The cases span the scenarios of Section V-C: costly, high-consequence integrated tests (X-43A, Saturn V), weak simulation (F-1, HTV-2, X-51A), and affordable flights (Falcon 1).</w:t>
       </w:r>
     </w:p>
     <w:p>
@@ -2830,7 +2846,7 @@
           <w:color w:val="1F2A37"/>
           <w:sz w:val="17"/>
         </w:rPr>
-        <w:t>Table S2-5. Documented sequences read through the model (Table 9 of the article).</w:t>
+        <w:t>Table S2-5. Documented sequences read through the model (Table 9 of the article). The third column is an interpretation, not a measured KMC state.</w:t>
       </w:r>
     </w:p>
     <w:tbl>
@@ -2868,7 +2884,7 @@
         </w:tc>
         <w:tc>
           <w:tcPr>
-            <w:tcW w:type="dxa" w:w="3121"/>
+            <w:tcW w:type="dxa" w:w="2980"/>
             <w:shd w:val="clear" w:color="auto" w:fill="DCE8F3"/>
           </w:tcPr>
           <w:p>
@@ -2887,7 +2903,7 @@
         </w:tc>
         <w:tc>
           <w:tcPr>
-            <w:tcW w:type="dxa" w:w="2838"/>
+            <w:tcW w:type="dxa" w:w="3121"/>
             <w:shd w:val="clear" w:color="auto" w:fill="DCE8F3"/>
           </w:tcPr>
           <w:p>
@@ -2900,13 +2916,13 @@
                 <w:color w:val="1F2A37"/>
                 <w:sz w:val="16"/>
               </w:rPr>
-              <w:t>KMC reading</w:t>
+              <w:t>Interpretive KMC reading</w:t>
             </w:r>
           </w:p>
         </w:tc>
         <w:tc>
           <w:tcPr>
-            <w:tcW w:type="dxa" w:w="1986"/>
+            <w:tcW w:type="dxa" w:w="1844"/>
             <w:shd w:val="clear" w:color="auto" w:fill="DCE8F3"/>
           </w:tcPr>
           <w:p>
@@ -2945,7 +2961,7 @@
         </w:tc>
         <w:tc>
           <w:tcPr>
-            <w:tcW w:type="dxa" w:w="3121"/>
+            <w:tcW w:type="dxa" w:w="2980"/>
           </w:tcPr>
           <w:p>
             <w:r/>
@@ -2963,7 +2979,7 @@
         </w:tc>
         <w:tc>
           <w:tcPr>
-            <w:tcW w:type="dxa" w:w="2838"/>
+            <w:tcW w:type="dxa" w:w="3121"/>
           </w:tcPr>
           <w:p>
             <w:r/>
@@ -2975,13 +2991,13 @@
                 <w:color w:val="1F2A37"/>
                 <w:sz w:val="16"/>
               </w:rPr>
-              <w:t>T without headroom → shock; E and S restore headroom → T succeeds</w:t>
+              <w:t>Flight on heritage models → failure; tests and revised models before the next flight (restored headroom)</w:t>
             </w:r>
           </w:p>
         </w:tc>
         <w:tc>
           <w:tcPr>
-            <w:tcW w:type="dxa" w:w="1986"/>
+            <w:tcW w:type="dxa" w:w="1844"/>
           </w:tcPr>
           <w:p>
             <w:r/>
@@ -3019,7 +3035,7 @@
         </w:tc>
         <w:tc>
           <w:tcPr>
-            <w:tcW w:type="dxa" w:w="3121"/>
+            <w:tcW w:type="dxa" w:w="2980"/>
           </w:tcPr>
           <w:p>
             <w:r/>
@@ -3037,7 +3053,7 @@
         </w:tc>
         <w:tc>
           <w:tcPr>
-            <w:tcW w:type="dxa" w:w="2838"/>
+            <w:tcW w:type="dxa" w:w="3121"/>
           </w:tcPr>
           <w:p>
             <w:r/>
@@ -3049,13 +3065,13 @@
                 <w:color w:val="1F2A37"/>
                 <w:sz w:val="16"/>
               </w:rPr>
-              <w:t>Few integrated tests; integrated-level shock; diagnosis before next T</w:t>
+              <w:t>Few integrated tests; integrated-level failure; diagnosis and verified fixes before the next flight</w:t>
             </w:r>
           </w:p>
         </w:tc>
         <w:tc>
           <w:tcPr>
-            <w:tcW w:type="dxa" w:w="1986"/>
+            <w:tcW w:type="dxa" w:w="1844"/>
           </w:tcPr>
           <w:p>
             <w:r/>
@@ -3093,7 +3109,7 @@
         </w:tc>
         <w:tc>
           <w:tcPr>
-            <w:tcW w:type="dxa" w:w="3121"/>
+            <w:tcW w:type="dxa" w:w="2980"/>
           </w:tcPr>
           <w:p>
             <w:r/>
@@ -3111,7 +3127,7 @@
         </w:tc>
         <w:tc>
           <w:tcPr>
-            <w:tcW w:type="dxa" w:w="2838"/>
+            <w:tcW w:type="dxa" w:w="3121"/>
           </w:tcPr>
           <w:p>
             <w:r/>
@@ -3123,13 +3139,13 @@
                 <w:color w:val="1F2A37"/>
                 <w:sz w:val="16"/>
               </w:rPr>
-              <w:t>Low data-limited ceiling; discriminating physical tests replace analysis</w:t>
+              <w:t>Analysis could not predict stability; controlled-perturbation tests on full-scale hardware (low data-limited ceiling)</w:t>
             </w:r>
           </w:p>
         </w:tc>
         <w:tc>
           <w:tcPr>
-            <w:tcW w:type="dxa" w:w="1986"/>
+            <w:tcW w:type="dxa" w:w="1844"/>
           </w:tcPr>
           <w:p>
             <w:r/>
@@ -3167,7 +3183,7 @@
         </w:tc>
         <w:tc>
           <w:tcPr>
-            <w:tcW w:type="dxa" w:w="3121"/>
+            <w:tcW w:type="dxa" w:w="2980"/>
           </w:tcPr>
           <w:p>
             <w:r/>
@@ -3185,7 +3201,7 @@
         </w:tc>
         <w:tc>
           <w:tcPr>
-            <w:tcW w:type="dxa" w:w="2838"/>
+            <w:tcW w:type="dxa" w:w="3121"/>
           </w:tcPr>
           <w:p>
             <w:r/>
@@ -3197,13 +3213,13 @@
                 <w:color w:val="1F2A37"/>
                 <w:sz w:val="16"/>
               </w:rPr>
-              <w:t>Test-first at low K; each shock adds knowledge</w:t>
+              <w:t>Affordable flights at low maturity; a different failure mode each time (test-first learning)</w:t>
             </w:r>
           </w:p>
         </w:tc>
         <w:tc>
           <w:tcPr>
-            <w:tcW w:type="dxa" w:w="1986"/>
+            <w:tcW w:type="dxa" w:w="1844"/>
           </w:tcPr>
           <w:p>
             <w:r/>
@@ -3241,7 +3257,7 @@
         </w:tc>
         <w:tc>
           <w:tcPr>
-            <w:tcW w:type="dxa" w:w="3121"/>
+            <w:tcW w:type="dxa" w:w="2980"/>
           </w:tcPr>
           <w:p>
             <w:r/>
@@ -3259,7 +3275,7 @@
         </w:tc>
         <w:tc>
           <w:tcPr>
-            <w:tcW w:type="dxa" w:w="2838"/>
+            <w:tcW w:type="dxa" w:w="3121"/>
           </w:tcPr>
           <w:p>
             <w:r/>
@@ -3271,13 +3287,13 @@
                 <w:color w:val="1F2A37"/>
                 <w:sz w:val="16"/>
               </w:rPr>
-              <w:t>Each flight both demonstration and main knowledge source; shocks on different claims</w:t>
+              <w:t>Flights were demonstrations and the main source of new information; failures on different subsystems</w:t>
             </w:r>
           </w:p>
         </w:tc>
         <w:tc>
           <w:tcPr>
-            <w:tcW w:type="dxa" w:w="1986"/>
+            <w:tcW w:type="dxa" w:w="1844"/>
           </w:tcPr>
           <w:p>
             <w:r/>
@@ -3315,7 +3331,7 @@
         </w:tc>
         <w:tc>
           <w:tcPr>
-            <w:tcW w:type="dxa" w:w="3121"/>
+            <w:tcW w:type="dxa" w:w="2980"/>
           </w:tcPr>
           <w:p>
             <w:r/>
@@ -3333,7 +3349,7 @@
         </w:tc>
         <w:tc>
           <w:tcPr>
-            <w:tcW w:type="dxa" w:w="2838"/>
+            <w:tcW w:type="dxa" w:w="3121"/>
           </w:tcPr>
           <w:p>
             <w:r/>
@@ -3345,44 +3361,13 @@
                 <w:color w:val="1F2A37"/>
                 <w:sz w:val="16"/>
               </w:rPr>
-              <w:t xml:space="preserve">Ground testing and modeling could not reach </w:t>
-            </w:r>
-            <w:r>
-              <w:rPr>
-                <w:rFonts w:ascii="Arial" w:hAnsi="Arial"/>
-                <w:b w:val="0"/>
-                <w:i/>
-                <w:color w:val="1F2A37"/>
-                <w:sz w:val="16"/>
-              </w:rPr>
-              <w:t>K</w:t>
-            </w:r>
-            <w:r>
-              <w:rPr>
-                <w:rFonts w:ascii="Arial" w:hAnsi="Arial"/>
-                <w:b w:val="0"/>
-                <w:i/>
-                <w:color w:val="1F2A37"/>
-                <w:sz w:val="16"/>
-                <w:vertAlign w:val="subscript"/>
-              </w:rPr>
-              <w:t>need</w:t>
-            </w:r>
-            <w:r>
-              <w:rPr>
-                <w:rFonts w:ascii="Arial" w:hAnsi="Arial" w:eastAsia="Arial"/>
-                <w:b w:val="0"/>
-                <w:i w:val="0"/>
-                <w:color w:val="1F2A37"/>
-                <w:sz w:val="16"/>
-              </w:rPr>
-              <w:t>; flight-only learning</w:t>
+              <w:t>Program stated that ground tests and modeling could not predict the flight environment (low data-limited ceiling); learning without a terminal success</w:t>
             </w:r>
           </w:p>
         </w:tc>
         <w:tc>
           <w:tcPr>
-            <w:tcW w:type="dxa" w:w="1986"/>
+            <w:tcW w:type="dxa" w:w="1844"/>
           </w:tcPr>
           <w:p>
             <w:r/>
@@ -3444,7 +3429,38 @@
           <w:color w:val="1F2A37"/>
           <w:sz w:val="20"/>
         </w:rPr>
-        <w:t>The cases were selected purposively and read with the outcomes known; the coding was not blinded or preregistered. Public documents omit export-controlled material, contemporary decision records, and activity-level costs, so no numerical K or M, no cost of alternatives, and no earlier detection or avoided loss can be established. The readings show that the mechanisms of the model are visible in documented decisions; they do not calibrate the model, test its coefficients, or show that KMC would have produced better decisions than the reviews the programs carried out.</w:t>
+        <w:t xml:space="preserve">The cases were selected purposively and read with the outcomes known; the coding was not blinded or preregistered. Public documents omit export-controlled material, contemporary decision records, and activity-level costs, so no numerical K or M, no cost of alternatives, and no earlier detection or avoided loss can be established. The readings show that the mechanisms of the model are visible in documented decisions; they do not calibrate the model, test its coefficients, or show that KMC would have produced better decisions than the reviews the programs carried out. Model terms used in the readings (headroom, data-limited ceiling, </w:t>
+      </w:r>
+      <w:r>
+        <w:rPr>
+          <w:rFonts w:ascii="Arial" w:hAnsi="Arial"/>
+          <w:b w:val="0"/>
+          <w:i/>
+          <w:color w:val="1F2A37"/>
+          <w:sz w:val="20"/>
+        </w:rPr>
+        <w:t>K</w:t>
+      </w:r>
+      <w:r>
+        <w:rPr>
+          <w:rFonts w:ascii="Arial" w:hAnsi="Arial"/>
+          <w:b w:val="0"/>
+          <w:i/>
+          <w:color w:val="1F2A37"/>
+          <w:sz w:val="20"/>
+          <w:vertAlign w:val="subscript"/>
+        </w:rPr>
+        <w:t>need</w:t>
+      </w:r>
+      <w:r>
+        <w:rPr>
+          <w:rFonts w:ascii="Arial" w:hAnsi="Arial" w:eastAsia="Arial"/>
+          <w:b w:val="0"/>
+          <w:i w:val="0"/>
+          <w:color w:val="1F2A37"/>
+          <w:sz w:val="20"/>
+        </w:rPr>
+        <w:t>) are interpretations; the observable content of each case is the documented sequence of tests, failures, and corrections.</w:t>
       </w:r>
     </w:p>
     <w:p>

</xml_diff>

<commit_message>
S2: model regime marked as interpretive, date of the 2004 annual report (published 2006), pagination
</commit_message>
<xml_diff>
--- a/supplementary/KMC_Supplementary_S2_Documented_Programs.docx
+++ b/supplementary/KMC_Supplementary_S2_Documented_Programs.docx
@@ -52,6 +52,7 @@
     </w:p>
     <w:p>
       <w:pPr>
+        <w:keepNext/>
         <w:spacing w:after="80" w:before="160" w:line="276" w:lineRule="auto"/>
         <w:jc w:val="left"/>
       </w:pPr>
@@ -100,6 +101,7 @@
     </w:p>
     <w:p>
       <w:pPr>
+        <w:keepNext/>
         <w:spacing w:after="80" w:before="160" w:line="276" w:lineRule="auto"/>
         <w:jc w:val="left"/>
       </w:pPr>
@@ -116,6 +118,7 @@
     </w:p>
     <w:p>
       <w:pPr>
+        <w:keepNext/>
         <w:spacing w:after="60" w:before="80" w:line="276" w:lineRule="auto"/>
         <w:jc w:val="left"/>
       </w:pPr>
@@ -159,7 +162,7 @@
           <w:color w:val="1F2A37"/>
           <w:sz w:val="20"/>
         </w:rPr>
-        <w:t>The bounded corpus comprises eight public documents dated 2000–2025: the preflight program paper [54], the mishap investigation [14], the return-to-flight review [55], two NASA releases on the second flight [56], [57], the flight-2 guidance and control paper [58], the 2004 research engineering report [59], and the NASA historical page [60]. From them, 19 parent records yield 20 observations, one of which (a conflicting release altitude) is retained only for discrepancy auditing. A 2004 incident release [61] and a lessons-learned review [62] were added later as a separately logged extension and did not change the original records.</w:t>
+        <w:t>The bounded corpus comprises eight public documents dated 2000–2025: the preflight program paper [54], the mishap investigation [14], the return-to-flight review [55], two NASA releases on the second flight [56], [57], the flight-2 guidance and control paper [58], the 2004 Research Engineering Annual Report, published in June 2006 [59], and the NASA historical page [60]. From them, 19 parent records yield 20 observations, one of which (a conflicting release altitude) is retained only for discrepancy auditing. A 2004 incident release [61] and a lessons-learned review [62] were added later as a separately logged extension and did not change the original records.</w:t>
       </w:r>
     </w:p>
     <w:p>
@@ -196,6 +199,7 @@
     </w:p>
     <w:p>
       <w:pPr>
+        <w:keepNext/>
         <w:spacing w:after="60" w:before="80" w:line="276" w:lineRule="auto"/>
         <w:jc w:val="left"/>
       </w:pPr>
@@ -228,6 +232,7 @@
     </w:p>
     <w:p>
       <w:pPr>
+        <w:keepNext/>
         <w:spacing w:after="60" w:before="80" w:line="276" w:lineRule="auto"/>
         <w:jc w:val="left"/>
       </w:pPr>
@@ -255,11 +260,13 @@
           <w:color w:val="1F2A37"/>
           <w:sz w:val="20"/>
         </w:rPr>
-        <w:t>The preflight paper reported control-law refinement and Monte Carlo analysis of aerodynamic and flight-control uncertainties, and a trajectory different from that of the heritage booster [54]. After the loss of control during boost on 2 June 2001, the investigation found inaccuracies in inherited and HXLV-specific models: corrected nominal models reduced the predicted roll-axis gain margin from 8 dB to less than 2 dB against a 6 dB requirement, and reproducing the mishap required combining the model corrections with parameter uncertainty [14] (Fig. S2-1). Return to flight combined wind-tunnel and actuator tests, revised models, comparisons of independent boost simulations, stronger actuators, and propellant off-loading for a higher-altitude release that reduced exposure [55], [56]. A test-setup anomaly on 11 February 2004 exceeded the qualified actuator torque and led to replacement and investigation before the second flight [61]. On 27 March 2004 the HXLV delivered the research vehicle at 28.67 km (94,069 ft) against 28.63 km (93,932 ft) planned and at Mach 6.946 against 7.075 [57], [58]; the 2004 report states that both the Mach 7 and the Mach 10 flights delivered the research vehicle within the separation tolerances [59]. A lessons-learned review relates the accident to heritage assumptions, representative testing, stability margins, and uncertainty and dynamic modeling [62]. Fig. S2-2 separates the event dates from the dates of the documents that report them.</w:t>
+        <w:t>The preflight paper reported control-law refinement and Monte Carlo analysis of aerodynamic and flight-control uncertainties, and a trajectory different from that of the heritage booster [54]. After the loss of control during boost on 2 June 2001, the investigation found inaccuracies in inherited and HXLV-specific models: corrected nominal models reduced the predicted roll-axis gain margin from 8 dB to less than 2 dB against a 6 dB requirement, and reproducing the mishap required combining the model corrections with parameter uncertainty [14] (Fig. S2-1). Return to flight combined wind-tunnel and actuator tests, revised models, comparisons of independent boost simulations, stronger actuators, and propellant off-loading for a higher-altitude release that reduced exposure [55], [56]. A test-setup anomaly on 11 February 2004 exceeded the qualified actuator torque and led to replacement and investigation before the second flight [61]. On 27 March 2004 the HXLV delivered the research vehicle at 28.67 km (94,069 ft) against 28.63 km (93,932 ft) planned and at Mach 6.946 against 7.075 [57], [58]; the 2004 Research Engineering Annual Report, published in June 2006, states that both the Mach 7 and the Mach 10 flights delivered the research vehicle within the specified separation tolerances [59]. A lessons-learned review relates the accident to heritage assumptions, representative testing, stability margins, and uncertainty and dynamic modeling [62]. Fig. S2-2 separates the event dates from the dates of the documents that report them.</w:t>
       </w:r>
     </w:p>
     <w:p>
       <w:pPr>
+        <w:keepNext/>
+        <w:keepLines/>
         <w:jc w:val="center"/>
       </w:pPr>
       <w:r>
@@ -315,6 +322,8 @@
     </w:p>
     <w:p>
       <w:pPr>
+        <w:keepNext/>
+        <w:keepLines/>
         <w:jc w:val="center"/>
       </w:pPr>
       <w:r>
@@ -370,6 +379,7 @@
     </w:p>
     <w:p>
       <w:pPr>
+        <w:keepNext/>
         <w:spacing w:after="60" w:before="80" w:line="276" w:lineRule="auto"/>
         <w:jc w:val="left"/>
       </w:pPr>
@@ -433,6 +443,7 @@
     </w:p>
     <w:p>
       <w:pPr>
+        <w:keepNext/>
         <w:spacing w:after="60" w:before="80" w:line="276" w:lineRule="auto"/>
         <w:jc w:val="left"/>
       </w:pPr>
@@ -461,12 +472,19 @@
         <w:gridCol w:w="2412"/>
       </w:tblGrid>
       <w:tr>
+        <w:trPr>
+          <w:cantSplit/>
+          <w:tblHeader/>
+        </w:trPr>
         <w:tc>
           <w:tcPr>
             <w:tcW w:type="dxa" w:w="2375"/>
             <w:shd w:val="clear" w:color="auto" w:fill="DCE8F3"/>
           </w:tcPr>
           <w:p>
+            <w:pPr>
+              <w:keepNext/>
+            </w:pPr>
             <w:r/>
             <w:r>
               <w:rPr>
@@ -486,6 +504,9 @@
             <w:shd w:val="clear" w:color="auto" w:fill="DCE8F3"/>
           </w:tcPr>
           <w:p>
+            <w:pPr>
+              <w:keepNext/>
+            </w:pPr>
             <w:r/>
             <w:r>
               <w:rPr>
@@ -505,6 +526,9 @@
             <w:shd w:val="clear" w:color="auto" w:fill="DCE8F3"/>
           </w:tcPr>
           <w:p>
+            <w:pPr>
+              <w:keepNext/>
+            </w:pPr>
             <w:r/>
             <w:r>
               <w:rPr>
@@ -524,6 +548,9 @@
             <w:shd w:val="clear" w:color="auto" w:fill="DCE8F3"/>
           </w:tcPr>
           <w:p>
+            <w:pPr>
+              <w:keepNext/>
+            </w:pPr>
             <w:r/>
             <w:r>
               <w:rPr>
@@ -539,11 +566,17 @@
         </w:tc>
       </w:tr>
       <w:tr>
+        <w:trPr>
+          <w:cantSplit/>
+        </w:trPr>
         <w:tc>
           <w:tcPr>
             <w:tcW w:type="dxa" w:w="2375"/>
           </w:tcPr>
           <w:p>
+            <w:pPr>
+              <w:keepNext/>
+            </w:pPr>
             <w:r/>
             <w:r>
               <w:rPr>
@@ -562,6 +595,9 @@
             <w:tcW w:type="dxa" w:w="2226"/>
           </w:tcPr>
           <w:p>
+            <w:pPr>
+              <w:keepNext/>
+            </w:pPr>
             <w:r/>
             <w:r>
               <w:rPr>
@@ -580,6 +616,9 @@
             <w:tcW w:type="dxa" w:w="2523"/>
           </w:tcPr>
           <w:p>
+            <w:pPr>
+              <w:keepNext/>
+            </w:pPr>
             <w:r/>
             <w:r>
               <w:rPr>
@@ -598,6 +637,9 @@
             <w:tcW w:type="dxa" w:w="2523"/>
           </w:tcPr>
           <w:p>
+            <w:pPr>
+              <w:keepNext/>
+            </w:pPr>
             <w:r/>
             <w:r>
               <w:rPr>
@@ -613,11 +655,17 @@
         </w:tc>
       </w:tr>
       <w:tr>
+        <w:trPr>
+          <w:cantSplit/>
+        </w:trPr>
         <w:tc>
           <w:tcPr>
             <w:tcW w:type="dxa" w:w="2375"/>
           </w:tcPr>
           <w:p>
+            <w:pPr>
+              <w:keepNext/>
+            </w:pPr>
             <w:r/>
             <w:r>
               <w:rPr>
@@ -636,6 +684,9 @@
             <w:tcW w:type="dxa" w:w="2226"/>
           </w:tcPr>
           <w:p>
+            <w:pPr>
+              <w:keepNext/>
+            </w:pPr>
             <w:r/>
             <w:r>
               <w:rPr>
@@ -654,6 +705,9 @@
             <w:tcW w:type="dxa" w:w="2523"/>
           </w:tcPr>
           <w:p>
+            <w:pPr>
+              <w:keepNext/>
+            </w:pPr>
             <w:r/>
             <w:r>
               <w:rPr>
@@ -672,6 +726,9 @@
             <w:tcW w:type="dxa" w:w="2523"/>
           </w:tcPr>
           <w:p>
+            <w:pPr>
+              <w:keepNext/>
+            </w:pPr>
             <w:r/>
             <w:r>
               <w:rPr>
@@ -687,11 +744,17 @@
         </w:tc>
       </w:tr>
       <w:tr>
+        <w:trPr>
+          <w:cantSplit/>
+        </w:trPr>
         <w:tc>
           <w:tcPr>
             <w:tcW w:type="dxa" w:w="2375"/>
           </w:tcPr>
           <w:p>
+            <w:pPr>
+              <w:keepNext/>
+            </w:pPr>
             <w:r/>
             <w:r>
               <w:rPr>
@@ -710,6 +773,9 @@
             <w:tcW w:type="dxa" w:w="2226"/>
           </w:tcPr>
           <w:p>
+            <w:pPr>
+              <w:keepNext/>
+            </w:pPr>
             <w:r/>
             <w:r>
               <w:rPr>
@@ -728,6 +794,9 @@
             <w:tcW w:type="dxa" w:w="2523"/>
           </w:tcPr>
           <w:p>
+            <w:pPr>
+              <w:keepNext/>
+            </w:pPr>
             <w:r/>
             <w:r>
               <w:rPr>
@@ -746,6 +815,9 @@
             <w:tcW w:type="dxa" w:w="2523"/>
           </w:tcPr>
           <w:p>
+            <w:pPr>
+              <w:keepNext/>
+            </w:pPr>
             <w:r/>
             <w:r>
               <w:rPr>
@@ -761,11 +833,17 @@
         </w:tc>
       </w:tr>
       <w:tr>
+        <w:trPr>
+          <w:cantSplit/>
+        </w:trPr>
         <w:tc>
           <w:tcPr>
             <w:tcW w:type="dxa" w:w="2375"/>
           </w:tcPr>
           <w:p>
+            <w:pPr>
+              <w:keepNext/>
+            </w:pPr>
             <w:r/>
             <w:r>
               <w:rPr>
@@ -784,6 +862,9 @@
             <w:tcW w:type="dxa" w:w="2226"/>
           </w:tcPr>
           <w:p>
+            <w:pPr>
+              <w:keepNext/>
+            </w:pPr>
             <w:r/>
             <w:r>
               <w:rPr>
@@ -802,6 +883,9 @@
             <w:tcW w:type="dxa" w:w="2523"/>
           </w:tcPr>
           <w:p>
+            <w:pPr>
+              <w:keepNext/>
+            </w:pPr>
             <w:r/>
             <w:r>
               <w:rPr>
@@ -820,6 +904,9 @@
             <w:tcW w:type="dxa" w:w="2523"/>
           </w:tcPr>
           <w:p>
+            <w:pPr>
+              <w:keepNext/>
+            </w:pPr>
             <w:r/>
             <w:r>
               <w:rPr>
@@ -835,11 +922,17 @@
         </w:tc>
       </w:tr>
       <w:tr>
+        <w:trPr>
+          <w:cantSplit/>
+        </w:trPr>
         <w:tc>
           <w:tcPr>
             <w:tcW w:type="dxa" w:w="2375"/>
           </w:tcPr>
           <w:p>
+            <w:pPr>
+              <w:keepNext w:val="0"/>
+            </w:pPr>
             <w:r/>
             <w:r>
               <w:rPr>
@@ -858,6 +951,9 @@
             <w:tcW w:type="dxa" w:w="2226"/>
           </w:tcPr>
           <w:p>
+            <w:pPr>
+              <w:keepNext w:val="0"/>
+            </w:pPr>
             <w:r/>
             <w:r>
               <w:rPr>
@@ -876,6 +972,9 @@
             <w:tcW w:type="dxa" w:w="2523"/>
           </w:tcPr>
           <w:p>
+            <w:pPr>
+              <w:keepNext w:val="0"/>
+            </w:pPr>
             <w:r/>
             <w:r>
               <w:rPr>
@@ -894,6 +993,9 @@
             <w:tcW w:type="dxa" w:w="2523"/>
           </w:tcPr>
           <w:p>
+            <w:pPr>
+              <w:keepNext w:val="0"/>
+            </w:pPr>
             <w:r/>
             <w:r>
               <w:rPr>
@@ -926,6 +1028,7 @@
     </w:p>
     <w:p>
       <w:pPr>
+        <w:keepNext/>
         <w:spacing w:after="60" w:before="80" w:line="276" w:lineRule="auto"/>
         <w:jc w:val="left"/>
       </w:pPr>
@@ -954,12 +1057,19 @@
         <w:gridCol w:w="2412"/>
       </w:tblGrid>
       <w:tr>
+        <w:trPr>
+          <w:cantSplit/>
+          <w:tblHeader/>
+        </w:trPr>
         <w:tc>
           <w:tcPr>
             <w:tcW w:type="dxa" w:w="2969"/>
             <w:shd w:val="clear" w:color="auto" w:fill="DCE8F3"/>
           </w:tcPr>
           <w:p>
+            <w:pPr>
+              <w:keepNext/>
+            </w:pPr>
             <w:r/>
             <w:r>
               <w:rPr>
@@ -979,6 +1089,9 @@
             <w:shd w:val="clear" w:color="auto" w:fill="DCE8F3"/>
           </w:tcPr>
           <w:p>
+            <w:pPr>
+              <w:keepNext/>
+            </w:pPr>
             <w:r/>
             <w:r>
               <w:rPr>
@@ -998,6 +1111,9 @@
             <w:shd w:val="clear" w:color="auto" w:fill="DCE8F3"/>
           </w:tcPr>
           <w:p>
+            <w:pPr>
+              <w:keepNext/>
+            </w:pPr>
             <w:r/>
             <w:r>
               <w:rPr>
@@ -1017,6 +1133,9 @@
             <w:shd w:val="clear" w:color="auto" w:fill="DCE8F3"/>
           </w:tcPr>
           <w:p>
+            <w:pPr>
+              <w:keepNext/>
+            </w:pPr>
             <w:r/>
             <w:r>
               <w:rPr>
@@ -1032,11 +1151,17 @@
         </w:tc>
       </w:tr>
       <w:tr>
+        <w:trPr>
+          <w:cantSplit/>
+        </w:trPr>
         <w:tc>
           <w:tcPr>
             <w:tcW w:type="dxa" w:w="2969"/>
           </w:tcPr>
           <w:p>
+            <w:pPr>
+              <w:keepNext/>
+            </w:pPr>
             <w:r/>
             <w:r>
               <w:rPr>
@@ -1055,6 +1180,9 @@
             <w:tcW w:type="dxa" w:w="2078"/>
           </w:tcPr>
           <w:p>
+            <w:pPr>
+              <w:keepNext/>
+            </w:pPr>
             <w:r/>
             <w:r>
               <w:rPr>
@@ -1073,6 +1201,9 @@
             <w:tcW w:type="dxa" w:w="2375"/>
           </w:tcPr>
           <w:p>
+            <w:pPr>
+              <w:keepNext/>
+            </w:pPr>
             <w:r/>
             <w:r>
               <w:rPr>
@@ -1091,6 +1222,9 @@
             <w:tcW w:type="dxa" w:w="2226"/>
           </w:tcPr>
           <w:p>
+            <w:pPr>
+              <w:keepNext/>
+            </w:pPr>
             <w:r/>
             <w:r>
               <w:rPr>
@@ -1106,11 +1240,17 @@
         </w:tc>
       </w:tr>
       <w:tr>
+        <w:trPr>
+          <w:cantSplit/>
+        </w:trPr>
         <w:tc>
           <w:tcPr>
             <w:tcW w:type="dxa" w:w="2969"/>
           </w:tcPr>
           <w:p>
+            <w:pPr>
+              <w:keepNext/>
+            </w:pPr>
             <w:r/>
             <w:r>
               <w:rPr>
@@ -1129,6 +1269,9 @@
             <w:tcW w:type="dxa" w:w="2078"/>
           </w:tcPr>
           <w:p>
+            <w:pPr>
+              <w:keepNext/>
+            </w:pPr>
             <w:r/>
             <w:r>
               <w:rPr>
@@ -1147,6 +1290,9 @@
             <w:tcW w:type="dxa" w:w="2375"/>
           </w:tcPr>
           <w:p>
+            <w:pPr>
+              <w:keepNext/>
+            </w:pPr>
             <w:r/>
             <w:r>
               <w:rPr>
@@ -1165,6 +1311,9 @@
             <w:tcW w:type="dxa" w:w="2226"/>
           </w:tcPr>
           <w:p>
+            <w:pPr>
+              <w:keepNext/>
+            </w:pPr>
             <w:r/>
             <w:r>
               <w:rPr>
@@ -1180,11 +1329,17 @@
         </w:tc>
       </w:tr>
       <w:tr>
+        <w:trPr>
+          <w:cantSplit/>
+        </w:trPr>
         <w:tc>
           <w:tcPr>
             <w:tcW w:type="dxa" w:w="2969"/>
           </w:tcPr>
           <w:p>
+            <w:pPr>
+              <w:keepNext/>
+            </w:pPr>
             <w:r/>
             <w:r>
               <w:rPr>
@@ -1203,6 +1358,9 @@
             <w:tcW w:type="dxa" w:w="2078"/>
           </w:tcPr>
           <w:p>
+            <w:pPr>
+              <w:keepNext/>
+            </w:pPr>
             <w:r/>
             <w:r>
               <w:rPr>
@@ -1221,6 +1379,9 @@
             <w:tcW w:type="dxa" w:w="2375"/>
           </w:tcPr>
           <w:p>
+            <w:pPr>
+              <w:keepNext/>
+            </w:pPr>
             <w:r/>
             <w:r>
               <w:rPr>
@@ -1239,6 +1400,9 @@
             <w:tcW w:type="dxa" w:w="2226"/>
           </w:tcPr>
           <w:p>
+            <w:pPr>
+              <w:keepNext/>
+            </w:pPr>
             <w:r/>
             <w:r>
               <w:rPr>
@@ -1254,11 +1418,17 @@
         </w:tc>
       </w:tr>
       <w:tr>
+        <w:trPr>
+          <w:cantSplit/>
+        </w:trPr>
         <w:tc>
           <w:tcPr>
             <w:tcW w:type="dxa" w:w="2969"/>
           </w:tcPr>
           <w:p>
+            <w:pPr>
+              <w:keepNext/>
+            </w:pPr>
             <w:r/>
             <w:r>
               <w:rPr>
@@ -1277,6 +1447,9 @@
             <w:tcW w:type="dxa" w:w="2078"/>
           </w:tcPr>
           <w:p>
+            <w:pPr>
+              <w:keepNext/>
+            </w:pPr>
             <w:r/>
             <w:r>
               <w:rPr>
@@ -1295,6 +1468,9 @@
             <w:tcW w:type="dxa" w:w="2375"/>
           </w:tcPr>
           <w:p>
+            <w:pPr>
+              <w:keepNext/>
+            </w:pPr>
             <w:r/>
             <w:r>
               <w:rPr>
@@ -1313,6 +1489,9 @@
             <w:tcW w:type="dxa" w:w="2226"/>
           </w:tcPr>
           <w:p>
+            <w:pPr>
+              <w:keepNext/>
+            </w:pPr>
             <w:r/>
             <w:r>
               <w:rPr>
@@ -1328,11 +1507,17 @@
         </w:tc>
       </w:tr>
       <w:tr>
+        <w:trPr>
+          <w:cantSplit/>
+        </w:trPr>
         <w:tc>
           <w:tcPr>
             <w:tcW w:type="dxa" w:w="2969"/>
           </w:tcPr>
           <w:p>
+            <w:pPr>
+              <w:keepNext w:val="0"/>
+            </w:pPr>
             <w:r/>
             <w:r>
               <w:rPr>
@@ -1351,6 +1536,9 @@
             <w:tcW w:type="dxa" w:w="2078"/>
           </w:tcPr>
           <w:p>
+            <w:pPr>
+              <w:keepNext w:val="0"/>
+            </w:pPr>
             <w:r/>
             <w:r>
               <w:rPr>
@@ -1369,6 +1557,9 @@
             <w:tcW w:type="dxa" w:w="2375"/>
           </w:tcPr>
           <w:p>
+            <w:pPr>
+              <w:keepNext w:val="0"/>
+            </w:pPr>
             <w:r/>
             <w:r>
               <w:rPr>
@@ -1387,6 +1578,9 @@
             <w:tcW w:type="dxa" w:w="2226"/>
           </w:tcPr>
           <w:p>
+            <w:pPr>
+              <w:keepNext w:val="0"/>
+            </w:pPr>
             <w:r/>
             <w:r>
               <w:rPr>
@@ -1419,6 +1613,7 @@
     </w:p>
     <w:p>
       <w:pPr>
+        <w:keepNext/>
         <w:spacing w:after="60" w:before="80" w:line="276" w:lineRule="auto"/>
         <w:jc w:val="left"/>
       </w:pPr>
@@ -1447,12 +1642,19 @@
         <w:gridCol w:w="2412"/>
       </w:tblGrid>
       <w:tr>
+        <w:trPr>
+          <w:cantSplit/>
+          <w:tblHeader/>
+        </w:trPr>
         <w:tc>
           <w:tcPr>
             <w:tcW w:type="dxa" w:w="1187"/>
             <w:shd w:val="clear" w:color="auto" w:fill="DCE8F3"/>
           </w:tcPr>
           <w:p>
+            <w:pPr>
+              <w:keepNext w:val="0"/>
+            </w:pPr>
             <w:r/>
             <w:r>
               <w:rPr>
@@ -1472,6 +1674,9 @@
             <w:shd w:val="clear" w:color="auto" w:fill="DCE8F3"/>
           </w:tcPr>
           <w:p>
+            <w:pPr>
+              <w:keepNext w:val="0"/>
+            </w:pPr>
             <w:r/>
             <w:r>
               <w:rPr>
@@ -1491,6 +1696,9 @@
             <w:shd w:val="clear" w:color="auto" w:fill="DCE8F3"/>
           </w:tcPr>
           <w:p>
+            <w:pPr>
+              <w:keepNext w:val="0"/>
+            </w:pPr>
             <w:r/>
             <w:r>
               <w:rPr>
@@ -1510,6 +1718,9 @@
             <w:shd w:val="clear" w:color="auto" w:fill="DCE8F3"/>
           </w:tcPr>
           <w:p>
+            <w:pPr>
+              <w:keepNext w:val="0"/>
+            </w:pPr>
             <w:r/>
             <w:r>
               <w:rPr>
@@ -1525,11 +1736,17 @@
         </w:tc>
       </w:tr>
       <w:tr>
+        <w:trPr>
+          <w:cantSplit/>
+        </w:trPr>
         <w:tc>
           <w:tcPr>
             <w:tcW w:type="dxa" w:w="1187"/>
           </w:tcPr>
           <w:p>
+            <w:pPr>
+              <w:keepNext w:val="0"/>
+            </w:pPr>
             <w:r/>
             <w:r>
               <w:rPr>
@@ -1548,6 +1765,9 @@
             <w:tcW w:type="dxa" w:w="3117"/>
           </w:tcPr>
           <w:p>
+            <w:pPr>
+              <w:keepNext w:val="0"/>
+            </w:pPr>
             <w:r/>
             <w:r>
               <w:rPr>
@@ -1566,6 +1786,9 @@
             <w:tcW w:type="dxa" w:w="2820"/>
           </w:tcPr>
           <w:p>
+            <w:pPr>
+              <w:keepNext w:val="0"/>
+            </w:pPr>
             <w:r/>
             <w:r>
               <w:rPr>
@@ -1584,6 +1807,9 @@
             <w:tcW w:type="dxa" w:w="2523"/>
           </w:tcPr>
           <w:p>
+            <w:pPr>
+              <w:keepNext w:val="0"/>
+            </w:pPr>
             <w:r/>
             <w:r>
               <w:rPr>
@@ -1599,11 +1825,17 @@
         </w:tc>
       </w:tr>
       <w:tr>
+        <w:trPr>
+          <w:cantSplit/>
+        </w:trPr>
         <w:tc>
           <w:tcPr>
             <w:tcW w:type="dxa" w:w="1187"/>
           </w:tcPr>
           <w:p>
+            <w:pPr>
+              <w:keepNext w:val="0"/>
+            </w:pPr>
             <w:r/>
             <w:r>
               <w:rPr>
@@ -1622,6 +1854,9 @@
             <w:tcW w:type="dxa" w:w="3117"/>
           </w:tcPr>
           <w:p>
+            <w:pPr>
+              <w:keepNext w:val="0"/>
+            </w:pPr>
             <w:r/>
             <w:r>
               <w:rPr>
@@ -1640,6 +1875,9 @@
             <w:tcW w:type="dxa" w:w="2820"/>
           </w:tcPr>
           <w:p>
+            <w:pPr>
+              <w:keepNext w:val="0"/>
+            </w:pPr>
             <w:r/>
             <w:r>
               <w:rPr>
@@ -1658,6 +1896,9 @@
             <w:tcW w:type="dxa" w:w="2523"/>
           </w:tcPr>
           <w:p>
+            <w:pPr>
+              <w:keepNext w:val="0"/>
+            </w:pPr>
             <w:r/>
             <w:r>
               <w:rPr>
@@ -1673,11 +1914,17 @@
         </w:tc>
       </w:tr>
       <w:tr>
+        <w:trPr>
+          <w:cantSplit/>
+        </w:trPr>
         <w:tc>
           <w:tcPr>
             <w:tcW w:type="dxa" w:w="1187"/>
           </w:tcPr>
           <w:p>
+            <w:pPr>
+              <w:keepNext w:val="0"/>
+            </w:pPr>
             <w:r/>
             <w:r>
               <w:rPr>
@@ -1696,6 +1943,9 @@
             <w:tcW w:type="dxa" w:w="3117"/>
           </w:tcPr>
           <w:p>
+            <w:pPr>
+              <w:keepNext w:val="0"/>
+            </w:pPr>
             <w:r/>
             <w:r>
               <w:rPr>
@@ -1714,6 +1964,9 @@
             <w:tcW w:type="dxa" w:w="2820"/>
           </w:tcPr>
           <w:p>
+            <w:pPr>
+              <w:keepNext w:val="0"/>
+            </w:pPr>
             <w:r/>
             <w:r>
               <w:rPr>
@@ -1732,6 +1985,9 @@
             <w:tcW w:type="dxa" w:w="2523"/>
           </w:tcPr>
           <w:p>
+            <w:pPr>
+              <w:keepNext w:val="0"/>
+            </w:pPr>
             <w:r/>
             <w:r>
               <w:rPr>
@@ -1747,11 +2003,17 @@
         </w:tc>
       </w:tr>
       <w:tr>
+        <w:trPr>
+          <w:cantSplit/>
+        </w:trPr>
         <w:tc>
           <w:tcPr>
             <w:tcW w:type="dxa" w:w="1187"/>
           </w:tcPr>
           <w:p>
+            <w:pPr>
+              <w:keepNext w:val="0"/>
+            </w:pPr>
             <w:r/>
             <w:r>
               <w:rPr>
@@ -1770,6 +2032,9 @@
             <w:tcW w:type="dxa" w:w="3117"/>
           </w:tcPr>
           <w:p>
+            <w:pPr>
+              <w:keepNext w:val="0"/>
+            </w:pPr>
             <w:r/>
             <w:r>
               <w:rPr>
@@ -1788,6 +2053,9 @@
             <w:tcW w:type="dxa" w:w="2820"/>
           </w:tcPr>
           <w:p>
+            <w:pPr>
+              <w:keepNext w:val="0"/>
+            </w:pPr>
             <w:r/>
             <w:r>
               <w:rPr>
@@ -1806,6 +2074,9 @@
             <w:tcW w:type="dxa" w:w="2523"/>
           </w:tcPr>
           <w:p>
+            <w:pPr>
+              <w:keepNext w:val="0"/>
+            </w:pPr>
             <w:r/>
             <w:r>
               <w:rPr>
@@ -1821,11 +2092,17 @@
         </w:tc>
       </w:tr>
       <w:tr>
+        <w:trPr>
+          <w:cantSplit/>
+        </w:trPr>
         <w:tc>
           <w:tcPr>
             <w:tcW w:type="dxa" w:w="1187"/>
           </w:tcPr>
           <w:p>
+            <w:pPr>
+              <w:keepNext w:val="0"/>
+            </w:pPr>
             <w:r/>
             <w:r>
               <w:rPr>
@@ -1844,6 +2121,9 @@
             <w:tcW w:type="dxa" w:w="3117"/>
           </w:tcPr>
           <w:p>
+            <w:pPr>
+              <w:keepNext w:val="0"/>
+            </w:pPr>
             <w:r/>
             <w:r>
               <w:rPr>
@@ -1862,6 +2142,9 @@
             <w:tcW w:type="dxa" w:w="2820"/>
           </w:tcPr>
           <w:p>
+            <w:pPr>
+              <w:keepNext w:val="0"/>
+            </w:pPr>
             <w:r/>
             <w:r>
               <w:rPr>
@@ -1880,6 +2163,9 @@
             <w:tcW w:type="dxa" w:w="2523"/>
           </w:tcPr>
           <w:p>
+            <w:pPr>
+              <w:keepNext w:val="0"/>
+            </w:pPr>
             <w:r/>
             <w:r>
               <w:rPr>
@@ -1895,11 +2181,17 @@
         </w:tc>
       </w:tr>
       <w:tr>
+        <w:trPr>
+          <w:cantSplit/>
+        </w:trPr>
         <w:tc>
           <w:tcPr>
             <w:tcW w:type="dxa" w:w="1187"/>
           </w:tcPr>
           <w:p>
+            <w:pPr>
+              <w:keepNext w:val="0"/>
+            </w:pPr>
             <w:r/>
             <w:r>
               <w:rPr>
@@ -1918,6 +2210,9 @@
             <w:tcW w:type="dxa" w:w="3117"/>
           </w:tcPr>
           <w:p>
+            <w:pPr>
+              <w:keepNext w:val="0"/>
+            </w:pPr>
             <w:r/>
             <w:r>
               <w:rPr>
@@ -1936,6 +2231,9 @@
             <w:tcW w:type="dxa" w:w="2820"/>
           </w:tcPr>
           <w:p>
+            <w:pPr>
+              <w:keepNext w:val="0"/>
+            </w:pPr>
             <w:r/>
             <w:r>
               <w:rPr>
@@ -1954,6 +2252,9 @@
             <w:tcW w:type="dxa" w:w="2523"/>
           </w:tcPr>
           <w:p>
+            <w:pPr>
+              <w:keepNext w:val="0"/>
+            </w:pPr>
             <w:r/>
             <w:r>
               <w:rPr>
@@ -1969,11 +2270,17 @@
         </w:tc>
       </w:tr>
       <w:tr>
+        <w:trPr>
+          <w:cantSplit/>
+        </w:trPr>
         <w:tc>
           <w:tcPr>
             <w:tcW w:type="dxa" w:w="1187"/>
           </w:tcPr>
           <w:p>
+            <w:pPr>
+              <w:keepNext w:val="0"/>
+            </w:pPr>
             <w:r/>
             <w:r>
               <w:rPr>
@@ -1992,6 +2299,9 @@
             <w:tcW w:type="dxa" w:w="3117"/>
           </w:tcPr>
           <w:p>
+            <w:pPr>
+              <w:keepNext w:val="0"/>
+            </w:pPr>
             <w:r/>
             <w:r>
               <w:rPr>
@@ -2010,6 +2320,9 @@
             <w:tcW w:type="dxa" w:w="2820"/>
           </w:tcPr>
           <w:p>
+            <w:pPr>
+              <w:keepNext w:val="0"/>
+            </w:pPr>
             <w:r/>
             <w:r>
               <w:rPr>
@@ -2028,6 +2341,9 @@
             <w:tcW w:type="dxa" w:w="2523"/>
           </w:tcPr>
           <w:p>
+            <w:pPr>
+              <w:keepNext w:val="0"/>
+            </w:pPr>
             <w:r/>
             <w:r>
               <w:rPr>
@@ -2060,6 +2376,7 @@
     </w:p>
     <w:p>
       <w:pPr>
+        <w:keepNext/>
         <w:spacing w:after="60" w:before="80" w:line="276" w:lineRule="auto"/>
         <w:jc w:val="left"/>
       </w:pPr>
@@ -2092,6 +2409,7 @@
     </w:p>
     <w:p>
       <w:pPr>
+        <w:keepNext/>
         <w:spacing w:after="60" w:before="80" w:line="276" w:lineRule="auto"/>
         <w:jc w:val="left"/>
       </w:pPr>
@@ -2120,12 +2438,19 @@
         <w:gridCol w:w="2412"/>
       </w:tblGrid>
       <w:tr>
+        <w:trPr>
+          <w:cantSplit/>
+          <w:tblHeader/>
+        </w:trPr>
         <w:tc>
           <w:tcPr>
             <w:tcW w:type="dxa" w:w="594"/>
             <w:shd w:val="clear" w:color="auto" w:fill="DCE8F3"/>
           </w:tcPr>
           <w:p>
+            <w:pPr>
+              <w:keepNext w:val="0"/>
+            </w:pPr>
             <w:r/>
             <w:r>
               <w:rPr>
@@ -2145,6 +2470,9 @@
             <w:shd w:val="clear" w:color="auto" w:fill="DCE8F3"/>
           </w:tcPr>
           <w:p>
+            <w:pPr>
+              <w:keepNext w:val="0"/>
+            </w:pPr>
             <w:r/>
             <w:r>
               <w:rPr>
@@ -2164,6 +2492,9 @@
             <w:shd w:val="clear" w:color="auto" w:fill="DCE8F3"/>
           </w:tcPr>
           <w:p>
+            <w:pPr>
+              <w:keepNext w:val="0"/>
+            </w:pPr>
             <w:r/>
             <w:r>
               <w:rPr>
@@ -2183,6 +2514,9 @@
             <w:shd w:val="clear" w:color="auto" w:fill="DCE8F3"/>
           </w:tcPr>
           <w:p>
+            <w:pPr>
+              <w:keepNext w:val="0"/>
+            </w:pPr>
             <w:r/>
             <w:r>
               <w:rPr>
@@ -2198,11 +2532,17 @@
         </w:tc>
       </w:tr>
       <w:tr>
+        <w:trPr>
+          <w:cantSplit/>
+        </w:trPr>
         <w:tc>
           <w:tcPr>
             <w:tcW w:type="dxa" w:w="594"/>
           </w:tcPr>
           <w:p>
+            <w:pPr>
+              <w:keepNext w:val="0"/>
+            </w:pPr>
             <w:r/>
             <w:r>
               <w:rPr>
@@ -2221,6 +2561,9 @@
             <w:tcW w:type="dxa" w:w="2969"/>
           </w:tcPr>
           <w:p>
+            <w:pPr>
+              <w:keepNext w:val="0"/>
+            </w:pPr>
             <w:r/>
             <w:r>
               <w:rPr>
@@ -2239,6 +2582,9 @@
             <w:tcW w:type="dxa" w:w="3117"/>
           </w:tcPr>
           <w:p>
+            <w:pPr>
+              <w:keepNext w:val="0"/>
+            </w:pPr>
             <w:r/>
             <w:r>
               <w:rPr>
@@ -2257,6 +2603,9 @@
             <w:tcW w:type="dxa" w:w="2969"/>
           </w:tcPr>
           <w:p>
+            <w:pPr>
+              <w:keepNext w:val="0"/>
+            </w:pPr>
             <w:r/>
             <w:r>
               <w:rPr>
@@ -2272,11 +2621,17 @@
         </w:tc>
       </w:tr>
       <w:tr>
+        <w:trPr>
+          <w:cantSplit/>
+        </w:trPr>
         <w:tc>
           <w:tcPr>
             <w:tcW w:type="dxa" w:w="594"/>
           </w:tcPr>
           <w:p>
+            <w:pPr>
+              <w:keepNext w:val="0"/>
+            </w:pPr>
             <w:r/>
             <w:r>
               <w:rPr>
@@ -2295,6 +2650,9 @@
             <w:tcW w:type="dxa" w:w="2969"/>
           </w:tcPr>
           <w:p>
+            <w:pPr>
+              <w:keepNext w:val="0"/>
+            </w:pPr>
             <w:r/>
             <w:r>
               <w:rPr>
@@ -2313,6 +2671,9 @@
             <w:tcW w:type="dxa" w:w="3117"/>
           </w:tcPr>
           <w:p>
+            <w:pPr>
+              <w:keepNext w:val="0"/>
+            </w:pPr>
             <w:r/>
             <w:r>
               <w:rPr>
@@ -2331,6 +2692,9 @@
             <w:tcW w:type="dxa" w:w="2969"/>
           </w:tcPr>
           <w:p>
+            <w:pPr>
+              <w:keepNext w:val="0"/>
+            </w:pPr>
             <w:r/>
             <w:r>
               <w:rPr>
@@ -2346,11 +2710,17 @@
         </w:tc>
       </w:tr>
       <w:tr>
+        <w:trPr>
+          <w:cantSplit/>
+        </w:trPr>
         <w:tc>
           <w:tcPr>
             <w:tcW w:type="dxa" w:w="594"/>
           </w:tcPr>
           <w:p>
+            <w:pPr>
+              <w:keepNext w:val="0"/>
+            </w:pPr>
             <w:r/>
             <w:r>
               <w:rPr>
@@ -2369,6 +2739,9 @@
             <w:tcW w:type="dxa" w:w="2969"/>
           </w:tcPr>
           <w:p>
+            <w:pPr>
+              <w:keepNext w:val="0"/>
+            </w:pPr>
             <w:r/>
             <w:r>
               <w:rPr>
@@ -2387,6 +2760,9 @@
             <w:tcW w:type="dxa" w:w="3117"/>
           </w:tcPr>
           <w:p>
+            <w:pPr>
+              <w:keepNext w:val="0"/>
+            </w:pPr>
             <w:r/>
             <w:r>
               <w:rPr>
@@ -2405,6 +2781,9 @@
             <w:tcW w:type="dxa" w:w="2969"/>
           </w:tcPr>
           <w:p>
+            <w:pPr>
+              <w:keepNext w:val="0"/>
+            </w:pPr>
             <w:r/>
             <w:r>
               <w:rPr>
@@ -2420,11 +2799,17 @@
         </w:tc>
       </w:tr>
       <w:tr>
+        <w:trPr>
+          <w:cantSplit/>
+        </w:trPr>
         <w:tc>
           <w:tcPr>
             <w:tcW w:type="dxa" w:w="594"/>
           </w:tcPr>
           <w:p>
+            <w:pPr>
+              <w:keepNext w:val="0"/>
+            </w:pPr>
             <w:r/>
             <w:r>
               <w:rPr>
@@ -2443,6 +2828,9 @@
             <w:tcW w:type="dxa" w:w="2969"/>
           </w:tcPr>
           <w:p>
+            <w:pPr>
+              <w:keepNext w:val="0"/>
+            </w:pPr>
             <w:r/>
             <w:r>
               <w:rPr>
@@ -2461,6 +2849,9 @@
             <w:tcW w:type="dxa" w:w="3117"/>
           </w:tcPr>
           <w:p>
+            <w:pPr>
+              <w:keepNext w:val="0"/>
+            </w:pPr>
             <w:r/>
             <w:r>
               <w:rPr>
@@ -2479,6 +2870,9 @@
             <w:tcW w:type="dxa" w:w="2969"/>
           </w:tcPr>
           <w:p>
+            <w:pPr>
+              <w:keepNext w:val="0"/>
+            </w:pPr>
             <w:r/>
             <w:r>
               <w:rPr>
@@ -2494,11 +2888,17 @@
         </w:tc>
       </w:tr>
       <w:tr>
+        <w:trPr>
+          <w:cantSplit/>
+        </w:trPr>
         <w:tc>
           <w:tcPr>
             <w:tcW w:type="dxa" w:w="594"/>
           </w:tcPr>
           <w:p>
+            <w:pPr>
+              <w:keepNext w:val="0"/>
+            </w:pPr>
             <w:r/>
             <w:r>
               <w:rPr>
@@ -2517,6 +2917,9 @@
             <w:tcW w:type="dxa" w:w="2969"/>
           </w:tcPr>
           <w:p>
+            <w:pPr>
+              <w:keepNext w:val="0"/>
+            </w:pPr>
             <w:r/>
             <w:r>
               <w:rPr>
@@ -2535,6 +2938,9 @@
             <w:tcW w:type="dxa" w:w="3117"/>
           </w:tcPr>
           <w:p>
+            <w:pPr>
+              <w:keepNext w:val="0"/>
+            </w:pPr>
             <w:r/>
             <w:r>
               <w:rPr>
@@ -2553,6 +2959,9 @@
             <w:tcW w:type="dxa" w:w="2969"/>
           </w:tcPr>
           <w:p>
+            <w:pPr>
+              <w:keepNext w:val="0"/>
+            </w:pPr>
             <w:r/>
             <w:r>
               <w:rPr>
@@ -2568,11 +2977,17 @@
         </w:tc>
       </w:tr>
       <w:tr>
+        <w:trPr>
+          <w:cantSplit/>
+        </w:trPr>
         <w:tc>
           <w:tcPr>
             <w:tcW w:type="dxa" w:w="594"/>
           </w:tcPr>
           <w:p>
+            <w:pPr>
+              <w:keepNext w:val="0"/>
+            </w:pPr>
             <w:r/>
             <w:r>
               <w:rPr>
@@ -2591,6 +3006,9 @@
             <w:tcW w:type="dxa" w:w="2969"/>
           </w:tcPr>
           <w:p>
+            <w:pPr>
+              <w:keepNext w:val="0"/>
+            </w:pPr>
             <w:r/>
             <w:r>
               <w:rPr>
@@ -2609,6 +3027,9 @@
             <w:tcW w:type="dxa" w:w="3117"/>
           </w:tcPr>
           <w:p>
+            <w:pPr>
+              <w:keepNext w:val="0"/>
+            </w:pPr>
             <w:r/>
             <w:r>
               <w:rPr>
@@ -2627,6 +3048,9 @@
             <w:tcW w:type="dxa" w:w="2969"/>
           </w:tcPr>
           <w:p>
+            <w:pPr>
+              <w:keepNext w:val="0"/>
+            </w:pPr>
             <w:r/>
             <w:r>
               <w:rPr>
@@ -2659,6 +3083,7 @@
     </w:p>
     <w:p>
       <w:pPr>
+        <w:keepNext/>
         <w:spacing w:after="80" w:before="160" w:line="276" w:lineRule="auto"/>
         <w:jc w:val="left"/>
       </w:pPr>
@@ -2691,6 +3116,7 @@
     </w:p>
     <w:p>
       <w:pPr>
+        <w:keepNext/>
         <w:spacing w:after="80" w:before="160" w:line="276" w:lineRule="auto"/>
         <w:jc w:val="left"/>
       </w:pPr>
@@ -2723,6 +3149,7 @@
     </w:p>
     <w:p>
       <w:pPr>
+        <w:keepNext/>
         <w:spacing w:after="80" w:before="160" w:line="276" w:lineRule="auto"/>
         <w:jc w:val="left"/>
       </w:pPr>
@@ -2755,6 +3182,7 @@
     </w:p>
     <w:p>
       <w:pPr>
+        <w:keepNext/>
         <w:spacing w:after="80" w:before="160" w:line="276" w:lineRule="auto"/>
         <w:jc w:val="left"/>
       </w:pPr>
@@ -2803,6 +3231,7 @@
     </w:p>
     <w:p>
       <w:pPr>
+        <w:keepNext/>
         <w:spacing w:after="80" w:before="160" w:line="276" w:lineRule="auto"/>
         <w:jc w:val="left"/>
       </w:pPr>
@@ -2830,11 +3259,12 @@
           <w:color w:val="1F2A37"/>
           <w:sz w:val="20"/>
         </w:rPr>
-        <w:t>Table S2-5 (Table 9 of the article) summarizes the six cases; its third column is an interpretation through the model, not a measured state. In the five flight programs, failures followed integrated tests that exposed configuration-specific or integrated-level gaps (X-43A flight 1, Apollo 6, Falcon 1 flights 1–3, X-51A flights 2–3, both HTV-2 flights). In four of them (X-43A, Saturn V, Falcon 1, X-51A) a successful flight followed diagnosis, separate-effects testing, or analysis; the HTV-2 shows that learning after failures does not guarantee a final demonstration. In the F-1 program, the absence of predictive capability led directly to controlled-perturbation tests on full-scale hardware. The cases span the scenarios of Section V-C: costly, high-consequence integrated tests (X-43A, Saturn V), weak simulation (F-1, HTV-2, X-51A), and affordable flights (Falcon 1).</w:t>
+        <w:t>Table S2-5 (Table 9 of the article) summarizes the six cases; its last two columns are interpretations through the model, not measured states. In the five flight programs, failures followed integrated tests that exposed configuration-specific or integrated-level gaps (X-43A flight 1, Apollo 6, Falcon 1 flights 1–3, X-51A flights 2–3, both HTV-2 flights). In four of them (X-43A, Saturn V, Falcon 1, X-51A) a successful flight followed diagnosis, separate-effects testing, or analysis; the HTV-2 shows that learning after failures does not guarantee a final demonstration. In the F-1 program, the absence of predictive capability led directly to controlled-perturbation tests on full-scale hardware. The cases span the scenarios of Section V-C: costly, high-consequence integrated tests (X-43A, Saturn V), weak simulation (F-1, HTV-2, X-51A), and affordable flights (Falcon 1).</w:t>
       </w:r>
     </w:p>
     <w:p>
       <w:pPr>
+        <w:keepNext/>
         <w:spacing w:after="60" w:before="80" w:line="276" w:lineRule="auto"/>
         <w:jc w:val="left"/>
       </w:pPr>
@@ -2846,7 +3276,7 @@
           <w:color w:val="1F2A37"/>
           <w:sz w:val="17"/>
         </w:rPr>
-        <w:t>Table S2-5. Documented sequences read through the model (Table 9 of the article). The third column is an interpretation, not a measured KMC state.</w:t>
+        <w:t>Table S2-5. Documented sequences read through the model (Table 9 of the article). The KMC reading and the assignment to a model regime are interpretations, not measured states.</w:t>
       </w:r>
     </w:p>
     <w:tbl>
@@ -2863,12 +3293,19 @@
         <w:gridCol w:w="2412"/>
       </w:tblGrid>
       <w:tr>
+        <w:trPr>
+          <w:cantSplit/>
+          <w:tblHeader/>
+        </w:trPr>
         <w:tc>
           <w:tcPr>
             <w:tcW w:type="dxa" w:w="1703"/>
             <w:shd w:val="clear" w:color="auto" w:fill="DCE8F3"/>
           </w:tcPr>
           <w:p>
+            <w:pPr>
+              <w:keepNext w:val="0"/>
+            </w:pPr>
             <w:r/>
             <w:r>
               <w:rPr>
@@ -2888,6 +3325,9 @@
             <w:shd w:val="clear" w:color="auto" w:fill="DCE8F3"/>
           </w:tcPr>
           <w:p>
+            <w:pPr>
+              <w:keepNext w:val="0"/>
+            </w:pPr>
             <w:r/>
             <w:r>
               <w:rPr>
@@ -2907,6 +3347,9 @@
             <w:shd w:val="clear" w:color="auto" w:fill="DCE8F3"/>
           </w:tcPr>
           <w:p>
+            <w:pPr>
+              <w:keepNext w:val="0"/>
+            </w:pPr>
             <w:r/>
             <w:r>
               <w:rPr>
@@ -2926,6 +3369,9 @@
             <w:shd w:val="clear" w:color="auto" w:fill="DCE8F3"/>
           </w:tcPr>
           <w:p>
+            <w:pPr>
+              <w:keepNext w:val="0"/>
+            </w:pPr>
             <w:r/>
             <w:r>
               <w:rPr>
@@ -2941,11 +3387,17 @@
         </w:tc>
       </w:tr>
       <w:tr>
+        <w:trPr>
+          <w:cantSplit/>
+        </w:trPr>
         <w:tc>
           <w:tcPr>
             <w:tcW w:type="dxa" w:w="1703"/>
           </w:tcPr>
           <w:p>
+            <w:pPr>
+              <w:keepNext w:val="0"/>
+            </w:pPr>
             <w:r/>
             <w:r>
               <w:rPr>
@@ -2964,6 +3416,9 @@
             <w:tcW w:type="dxa" w:w="2980"/>
           </w:tcPr>
           <w:p>
+            <w:pPr>
+              <w:keepNext w:val="0"/>
+            </w:pPr>
             <w:r/>
             <w:r>
               <w:rPr>
@@ -2982,6 +3437,9 @@
             <w:tcW w:type="dxa" w:w="3121"/>
           </w:tcPr>
           <w:p>
+            <w:pPr>
+              <w:keepNext w:val="0"/>
+            </w:pPr>
             <w:r/>
             <w:r>
               <w:rPr>
@@ -3000,6 +3458,9 @@
             <w:tcW w:type="dxa" w:w="1844"/>
           </w:tcPr>
           <w:p>
+            <w:pPr>
+              <w:keepNext w:val="0"/>
+            </w:pPr>
             <w:r/>
             <w:r>
               <w:rPr>
@@ -3015,11 +3476,17 @@
         </w:tc>
       </w:tr>
       <w:tr>
+        <w:trPr>
+          <w:cantSplit/>
+        </w:trPr>
         <w:tc>
           <w:tcPr>
             <w:tcW w:type="dxa" w:w="1703"/>
           </w:tcPr>
           <w:p>
+            <w:pPr>
+              <w:keepNext w:val="0"/>
+            </w:pPr>
             <w:r/>
             <w:r>
               <w:rPr>
@@ -3038,6 +3505,9 @@
             <w:tcW w:type="dxa" w:w="2980"/>
           </w:tcPr>
           <w:p>
+            <w:pPr>
+              <w:keepNext w:val="0"/>
+            </w:pPr>
             <w:r/>
             <w:r>
               <w:rPr>
@@ -3056,6 +3526,9 @@
             <w:tcW w:type="dxa" w:w="3121"/>
           </w:tcPr>
           <w:p>
+            <w:pPr>
+              <w:keepNext w:val="0"/>
+            </w:pPr>
             <w:r/>
             <w:r>
               <w:rPr>
@@ -3074,6 +3547,9 @@
             <w:tcW w:type="dxa" w:w="1844"/>
           </w:tcPr>
           <w:p>
+            <w:pPr>
+              <w:keepNext w:val="0"/>
+            </w:pPr>
             <w:r/>
             <w:r>
               <w:rPr>
@@ -3089,11 +3565,17 @@
         </w:tc>
       </w:tr>
       <w:tr>
+        <w:trPr>
+          <w:cantSplit/>
+        </w:trPr>
         <w:tc>
           <w:tcPr>
             <w:tcW w:type="dxa" w:w="1703"/>
           </w:tcPr>
           <w:p>
+            <w:pPr>
+              <w:keepNext w:val="0"/>
+            </w:pPr>
             <w:r/>
             <w:r>
               <w:rPr>
@@ -3112,6 +3594,9 @@
             <w:tcW w:type="dxa" w:w="2980"/>
           </w:tcPr>
           <w:p>
+            <w:pPr>
+              <w:keepNext w:val="0"/>
+            </w:pPr>
             <w:r/>
             <w:r>
               <w:rPr>
@@ -3130,6 +3615,9 @@
             <w:tcW w:type="dxa" w:w="3121"/>
           </w:tcPr>
           <w:p>
+            <w:pPr>
+              <w:keepNext w:val="0"/>
+            </w:pPr>
             <w:r/>
             <w:r>
               <w:rPr>
@@ -3148,6 +3636,9 @@
             <w:tcW w:type="dxa" w:w="1844"/>
           </w:tcPr>
           <w:p>
+            <w:pPr>
+              <w:keepNext w:val="0"/>
+            </w:pPr>
             <w:r/>
             <w:r>
               <w:rPr>
@@ -3163,11 +3654,17 @@
         </w:tc>
       </w:tr>
       <w:tr>
+        <w:trPr>
+          <w:cantSplit/>
+        </w:trPr>
         <w:tc>
           <w:tcPr>
             <w:tcW w:type="dxa" w:w="1703"/>
           </w:tcPr>
           <w:p>
+            <w:pPr>
+              <w:keepNext w:val="0"/>
+            </w:pPr>
             <w:r/>
             <w:r>
               <w:rPr>
@@ -3186,6 +3683,9 @@
             <w:tcW w:type="dxa" w:w="2980"/>
           </w:tcPr>
           <w:p>
+            <w:pPr>
+              <w:keepNext w:val="0"/>
+            </w:pPr>
             <w:r/>
             <w:r>
               <w:rPr>
@@ -3204,6 +3704,9 @@
             <w:tcW w:type="dxa" w:w="3121"/>
           </w:tcPr>
           <w:p>
+            <w:pPr>
+              <w:keepNext w:val="0"/>
+            </w:pPr>
             <w:r/>
             <w:r>
               <w:rPr>
@@ -3222,6 +3725,9 @@
             <w:tcW w:type="dxa" w:w="1844"/>
           </w:tcPr>
           <w:p>
+            <w:pPr>
+              <w:keepNext w:val="0"/>
+            </w:pPr>
             <w:r/>
             <w:r>
               <w:rPr>
@@ -3237,11 +3743,17 @@
         </w:tc>
       </w:tr>
       <w:tr>
+        <w:trPr>
+          <w:cantSplit/>
+        </w:trPr>
         <w:tc>
           <w:tcPr>
             <w:tcW w:type="dxa" w:w="1703"/>
           </w:tcPr>
           <w:p>
+            <w:pPr>
+              <w:keepNext w:val="0"/>
+            </w:pPr>
             <w:r/>
             <w:r>
               <w:rPr>
@@ -3260,6 +3772,9 @@
             <w:tcW w:type="dxa" w:w="2980"/>
           </w:tcPr>
           <w:p>
+            <w:pPr>
+              <w:keepNext w:val="0"/>
+            </w:pPr>
             <w:r/>
             <w:r>
               <w:rPr>
@@ -3278,6 +3793,9 @@
             <w:tcW w:type="dxa" w:w="3121"/>
           </w:tcPr>
           <w:p>
+            <w:pPr>
+              <w:keepNext w:val="0"/>
+            </w:pPr>
             <w:r/>
             <w:r>
               <w:rPr>
@@ -3296,6 +3814,9 @@
             <w:tcW w:type="dxa" w:w="1844"/>
           </w:tcPr>
           <w:p>
+            <w:pPr>
+              <w:keepNext w:val="0"/>
+            </w:pPr>
             <w:r/>
             <w:r>
               <w:rPr>
@@ -3311,11 +3832,17 @@
         </w:tc>
       </w:tr>
       <w:tr>
+        <w:trPr>
+          <w:cantSplit/>
+        </w:trPr>
         <w:tc>
           <w:tcPr>
             <w:tcW w:type="dxa" w:w="1703"/>
           </w:tcPr>
           <w:p>
+            <w:pPr>
+              <w:keepNext w:val="0"/>
+            </w:pPr>
             <w:r/>
             <w:r>
               <w:rPr>
@@ -3334,6 +3861,9 @@
             <w:tcW w:type="dxa" w:w="2980"/>
           </w:tcPr>
           <w:p>
+            <w:pPr>
+              <w:keepNext w:val="0"/>
+            </w:pPr>
             <w:r/>
             <w:r>
               <w:rPr>
@@ -3352,6 +3882,9 @@
             <w:tcW w:type="dxa" w:w="3121"/>
           </w:tcPr>
           <w:p>
+            <w:pPr>
+              <w:keepNext w:val="0"/>
+            </w:pPr>
             <w:r/>
             <w:r>
               <w:rPr>
@@ -3370,6 +3903,9 @@
             <w:tcW w:type="dxa" w:w="1844"/>
           </w:tcPr>
           <w:p>
+            <w:pPr>
+              <w:keepNext w:val="0"/>
+            </w:pPr>
             <w:r/>
             <w:r>
               <w:rPr>
@@ -3402,6 +3938,7 @@
     </w:p>
     <w:p>
       <w:pPr>
+        <w:keepNext/>
         <w:spacing w:after="80" w:before="160" w:line="276" w:lineRule="auto"/>
         <w:jc w:val="left"/>
       </w:pPr>

</xml_diff>